<commit_message>
fix: Built-in OCR uses system tesseract binary, friendly error messages
</commit_message>
<xml_diff>
--- a/docs/PrismX-Quotation.docx
+++ b/docs/PrismX-Quotation.docx
@@ -2,7 +2,6 @@
 <file path=word/document.xml><?xml version="1.0" encoding="utf-8"?>
 <w:document xmlns:wpc="http://schemas.microsoft.com/office/word/2010/wordprocessingCanvas" xmlns:mo="http://schemas.microsoft.com/office/mac/office/2008/main" xmlns:mc="http://schemas.openxmlformats.org/markup-compatibility/2006" xmlns:mv="urn:schemas-microsoft-com:mac:vml" xmlns:o="urn:schemas-microsoft-com:office:office" xmlns:r="http://schemas.openxmlformats.org/officeDocument/2006/relationships" xmlns:m="http://schemas.openxmlformats.org/officeDocument/2006/math" xmlns:v="urn:schemas-microsoft-com:vml" xmlns:wp14="http://schemas.microsoft.com/office/word/2010/wordprocessingDrawing" xmlns:wp="http://schemas.openxmlformats.org/drawingml/2006/wordprocessingDrawing" xmlns:w10="urn:schemas-microsoft-com:office:word" xmlns:w="http://schemas.openxmlformats.org/wordprocessingml/2006/main" xmlns:w14="http://schemas.microsoft.com/office/word/2010/wordml" xmlns:wpg="http://schemas.microsoft.com/office/word/2010/wordprocessingGroup" xmlns:wpi="http://schemas.microsoft.com/office/word/2010/wordprocessingInk" xmlns:wne="http://schemas.microsoft.com/office/word/2006/wordml" xmlns:wps="http://schemas.microsoft.com/office/word/2010/wordprocessingShape" mc:Ignorable="w14 wp14">
   <w:body>
-    <w:p/>
     <w:p/>
     <w:p>
       <w:pPr>
@@ -322,15 +321,6 @@
         <w:spacing w:after="60"/>
       </w:pPr>
       <w:r>
-        <w:t>Deal patterns: spot pricing with premium/discount, LBMA AM/PM fixing, limit orders</w:t>
-      </w:r>
-    </w:p>
-    <w:p>
-      <w:pPr>
-        <w:pStyle w:val="ListBullet"/>
-        <w:spacing w:after="60"/>
-      </w:pPr>
-      <w:r>
         <w:t>Payment method: USDT on TRC-20 (Tron network), HKD cash, bank transfers</w:t>
       </w:r>
     </w:p>
@@ -432,7 +422,7 @@
         <w:spacing w:after="60"/>
       </w:pPr>
       <w:r>
-        <w:t>Reports — daily, weekly, quarterly, yearly P&amp;L with metal and period filters</w:t>
+        <w:t>Reports — daily, weekly, quarterly, yearly with filters</w:t>
       </w:r>
     </w:p>
     <w:p>
@@ -450,7 +440,7 @@
         <w:spacing w:after="60"/>
       </w:pPr>
       <w:r>
-        <w:t>Live precious metal prices — London Fix (LBMA) rates</w:t>
+        <w:t>Live precious metal prices — London Fix (LBMA)</w:t>
       </w:r>
     </w:p>
     <w:p>
@@ -475,7 +465,7 @@
         <w:spacing w:after="60"/>
       </w:pPr>
       <w:r>
-        <w:t>Real-time message capture — every incoming and outgoing WhatsApp message</w:t>
+        <w:t>Real-time message capture — every incoming and outgoing message</w:t>
       </w:r>
     </w:p>
     <w:p>
@@ -493,7 +483,7 @@
         <w:spacing w:after="60"/>
       </w:pPr>
       <w:r>
-        <w:t>Lock detection — recognises "lock" keyword in English, Chinese (鎖價), and Arabic (قفل)</w:t>
+        <w:t>Lock detection — English, Chinese (鎖價), and Arabic (قفل)</w:t>
       </w:r>
     </w:p>
     <w:p>
@@ -511,7 +501,7 @@
         <w:spacing w:after="60"/>
       </w:pPr>
       <w:r>
-        <w:t>Participant tracking — who said what, deal counterparties identified</w:t>
+        <w:t>Participant tracking — deal counterparties identified</w:t>
       </w:r>
     </w:p>
     <w:p>
@@ -520,7 +510,7 @@
         <w:spacing w:after="60"/>
       </w:pPr>
       <w:r>
-        <w:t>Multi-language support — English, Chinese (Traditional + Simplified), Arabic</w:t>
+        <w:t>Multi-language — English, Chinese (Traditional + Simplified), Arabic</w:t>
       </w:r>
     </w:p>
     <w:p>
@@ -529,7 +519,7 @@
         <w:spacing w:after="60"/>
       </w:pPr>
       <w:r>
-        <w:t>WhatsApp tab in dashboard — all conversations visible, searchable</w:t>
+        <w:t>WhatsApp tab in dashboard — all conversations visible</w:t>
       </w:r>
     </w:p>
     <w:p>
@@ -554,7 +544,7 @@
         <w:spacing w:after="120"/>
       </w:pPr>
       <w:r>
-        <w:t>Reads images shared in WhatsApp conversations — payment confirmations, bar lists, weighing photos — and extracts structured data.</w:t>
+        <w:t>Reads images shared in WhatsApp — payment confirmations, bar lists, weighing photos — and extracts structured data.</w:t>
       </w:r>
     </w:p>
     <w:p>
@@ -590,7 +580,7 @@
         <w:spacing w:after="60"/>
       </w:pPr>
       <w:r>
-        <w:t>Multi-language OCR — English, Chinese, Arabic text extraction</w:t>
+        <w:t>Multi-language OCR — English, Chinese, Arabic</w:t>
       </w:r>
     </w:p>
     <w:p>
@@ -608,7 +598,7 @@
         <w:spacing w:after="60"/>
       </w:pPr>
       <w:r>
-        <w:t>Optional premium OCR: Google Cloud Vision (1,000 images/month free), Claude AI, or GPT-4o</w:t>
+        <w:t>Optional premium: Google Cloud Vision (1,000 images/month free), Claude AI, GPT-4o</w:t>
       </w:r>
     </w:p>
     <w:p>
@@ -617,7 +607,7 @@
         <w:spacing w:after="60"/>
       </w:pPr>
       <w:r>
-        <w:t>Automatic payment matching — links payment screenshots to corresponding deals</w:t>
+        <w:t>Automatic payment matching to corresponding deals</w:t>
       </w:r>
     </w:p>
     <w:p>
@@ -633,7 +623,7 @@
         <w:spacing w:after="120"/>
       </w:pPr>
       <w:r>
-        <w:t>Connects the PrismX dashboard to your existing OroSoft Neo trading software. Your staff continues using OroSoft as they do today — the dashboard reads data automatically.</w:t>
+        <w:t>Connects the dashboard to your existing OroSoft Neo trading software. Staff continues using OroSoft — the dashboard reads data automatically.</w:t>
       </w:r>
     </w:p>
     <w:p>
@@ -660,7 +650,7 @@
         <w:spacing w:after="60"/>
       </w:pPr>
       <w:r>
-        <w:t>Requires one-time setup on your Dubai server or AWS instance</w:t>
+        <w:t>One-time setup on your Dubai server or AWS instance</w:t>
       </w:r>
     </w:p>
     <w:p>
@@ -669,7 +659,7 @@
         <w:spacing w:after="60"/>
       </w:pPr>
       <w:r>
-        <w:t>Coordination with OroSoft technical team (Mumbai-based) if needed</w:t>
+        <w:t>Coordination with OroSoft technical team if needed</w:t>
       </w:r>
     </w:p>
     <w:p>
@@ -690,7 +680,7 @@
         <w:spacing w:after="120"/>
       </w:pPr>
       <w:r>
-        <w:t>Once the system is operational with real data, an AI-powered negotiation bot can be added that automatically responds to buyers on WhatsApp:</w:t>
+        <w:t>Once operational, an AI bot can be added that responds to buyers on WhatsApp automatically:</w:t>
       </w:r>
     </w:p>
     <w:p>
@@ -708,7 +698,7 @@
         <w:spacing w:after="60"/>
       </w:pPr>
       <w:r>
-        <w:t>Opens with your standard markup, negotiates within your boundaries</w:t>
+        <w:t>Negotiates within your boundaries — cannot go below your minimum</w:t>
       </w:r>
     </w:p>
     <w:p>
@@ -717,7 +707,7 @@
         <w:spacing w:after="60"/>
       </w:pPr>
       <w:r>
-        <w:t>Cannot go below your minimum price under any circumstances</w:t>
+        <w:t>Escalates large deals for manual approval</w:t>
       </w:r>
     </w:p>
     <w:p>
@@ -726,7 +716,7 @@
         <w:spacing w:after="60"/>
       </w:pPr>
       <w:r>
-        <w:t>Escalates large deals to your team for manual approval</w:t>
+        <w:t>Works 24/7 across time zones</w:t>
       </w:r>
     </w:p>
     <w:p>
@@ -735,16 +725,7 @@
         <w:spacing w:after="60"/>
       </w:pPr>
       <w:r>
-        <w:t>Works 24/7 across time zones — Dubai, Hong Kong, India</w:t>
-      </w:r>
-    </w:p>
-    <w:p>
-      <w:pPr>
-        <w:pStyle w:val="ListBullet"/>
-        <w:spacing w:after="60"/>
-      </w:pPr>
-      <w:r>
-        <w:t>Full audit trail of every conversation and price quoted</w:t>
+        <w:t>Full audit trail of every conversation</w:t>
       </w:r>
     </w:p>
     <w:p>
@@ -843,8 +824,6 @@
                 <w:sz w:val="18"/>
               </w:rPr>
               <w:t>PrismX MIS Dashboard</w:t>
-              <w:br/>
-              <w:t>Portfolio, P&amp;L, Stock, Reports, Delivery, Settlements</w:t>
             </w:r>
           </w:p>
         </w:tc>
@@ -886,8 +865,6 @@
                 <w:sz w:val="18"/>
               </w:rPr>
               <w:t>WhatsApp Business Intelligence Bot</w:t>
-              <w:br/>
-              <w:t>Real-time capture, deal detection, multi-language</w:t>
             </w:r>
           </w:p>
         </w:tc>
@@ -929,8 +906,6 @@
                 <w:sz w:val="18"/>
               </w:rPr>
               <w:t>Image Recognition (OCR)</w:t>
-              <w:br/>
-              <w:t>Payment screenshots, bar lists, receipts</w:t>
             </w:r>
           </w:p>
         </w:tc>
@@ -972,8 +947,6 @@
                 <w:sz w:val="18"/>
               </w:rPr>
               <w:t>OroSoft Data Bridge</w:t>
-              <w:br/>
-              <w:t>Connect existing software to dashboard</w:t>
             </w:r>
           </w:p>
         </w:tc>
@@ -1118,7 +1091,7 @@
               <w:rPr>
                 <w:sz w:val="18"/>
               </w:rPr>
-              <w:t>Annual Maintenance</w:t>
+              <w:t>Maintenance</w:t>
             </w:r>
           </w:p>
         </w:tc>
@@ -1131,9 +1104,7 @@
               <w:rPr>
                 <w:sz w:val="18"/>
               </w:rPr>
-              <w:t>Server hosting, updates, bug fixes, support</w:t>
-              <w:br/>
-              <w:t>(First year included free)</w:t>
+              <w:t>Server, updates, support (Year 1 free)</w:t>
             </w:r>
           </w:p>
         </w:tc>
@@ -1146,9 +1117,9 @@
               <w:rPr>
                 <w:sz w:val="18"/>
               </w:rPr>
-              <w:t>₹ 50,000 / year</w:t>
+              <w:t>₹ 50,000/year</w:t>
               <w:br/>
-              <w:t>(Year 2 onwards)</w:t>
+              <w:t>(from Year 2)</w:t>
             </w:r>
           </w:p>
         </w:tc>
@@ -1160,7 +1131,7 @@
         <w:spacing w:after="120"/>
       </w:pPr>
       <w:r>
-        <w:t>Note: Module 1 (Dashboard) is included at no charge as it has been demonstrated and is ready for deployment. The investment is for Modules 2, 3, and 4 which involve integration with your live WhatsApp Business account and existing software.</w:t>
+        <w:t>Note: Module 1 (Dashboard) is included at no charge. The investment covers Modules 2, 3, and 4 — live WhatsApp integration, image recognition, and OroSoft connectivity.</w:t>
       </w:r>
     </w:p>
     <w:p>
@@ -1177,7 +1148,7 @@
         <w:spacing w:after="60"/>
       </w:pPr>
       <w:r>
-        <w:t>50% on acceptance of this quotation — ₹ 1,12,500</w:t>
+        <w:t>50% on acceptance — ₹ 1,12,500</w:t>
       </w:r>
     </w:p>
     <w:p>
@@ -1186,7 +1157,7 @@
         <w:spacing w:after="60"/>
       </w:pPr>
       <w:r>
-        <w:t>50% on completion and go-live — ₹ 1,12,500</w:t>
+        <w:t>50% on go-live — ₹ 1,12,500</w:t>
       </w:r>
     </w:p>
     <w:p>
@@ -1195,7 +1166,7 @@
         <w:spacing w:after="60"/>
       </w:pPr>
       <w:r>
-        <w:t>Annual maintenance from Year 2: ₹ 50,000 per year (first year included)</w:t>
+        <w:t>Annual maintenance from Year 2: ₹ 50,000/year (Year 1 included free)</w:t>
       </w:r>
     </w:p>
     <w:p>
@@ -1285,9 +1256,7 @@
               <w:rPr>
                 <w:sz w:val="18"/>
               </w:rPr>
-              <w:t>WhatsApp Business API connection</w:t>
-              <w:br/>
-              <w:t>Live message capture on dashboard</w:t>
+              <w:t>WhatsApp API connection + live messages</w:t>
             </w:r>
           </w:p>
         </w:tc>
@@ -1300,7 +1269,7 @@
               <w:rPr>
                 <w:sz w:val="18"/>
               </w:rPr>
-              <w:t>Within 7 days of Meta setup</w:t>
+              <w:t>7 days</w:t>
             </w:r>
           </w:p>
         </w:tc>
@@ -1328,9 +1297,7 @@
               <w:rPr>
                 <w:sz w:val="18"/>
               </w:rPr>
-              <w:t>Deal auto-detection from live messages</w:t>
-              <w:br/>
-              <w:t>Image OCR for payment screenshots</w:t>
+              <w:t>Deal detection + Image OCR</w:t>
             </w:r>
           </w:p>
         </w:tc>
@@ -1371,9 +1338,7 @@
               <w:rPr>
                 <w:sz w:val="18"/>
               </w:rPr>
-              <w:t>OroSoft data bridge</w:t>
-              <w:br/>
-              <w:t>Full system integration and testing</w:t>
+              <w:t>OroSoft bridge + integration testing</w:t>
             </w:r>
           </w:p>
         </w:tc>
@@ -1414,9 +1379,7 @@
               <w:rPr>
                 <w:sz w:val="18"/>
               </w:rPr>
-              <w:t>Staff training (30 min)</w:t>
-              <w:br/>
-              <w:t>Go-live</w:t>
+              <w:t>Staff training + Go-live</w:t>
             </w:r>
           </w:p>
         </w:tc>
@@ -1459,7 +1422,7 @@
         <w:spacing w:after="60"/>
       </w:pPr>
       <w:r>
-        <w:t>OroSoft version details and server access (read-only) for data bridge</w:t>
+        <w:t>OroSoft version details and server access (read-only)</w:t>
       </w:r>
     </w:p>
     <w:p>
@@ -1490,10 +1453,11 @@
     </w:p>
     <w:p>
       <w:pPr>
-        <w:spacing w:after="120"/>
+        <w:pStyle w:val="ListBullet"/>
+        <w:spacing w:after="60"/>
       </w:pPr>
       <w:r>
-        <w:t>The system can be hosted in two ways:</w:t>
+        <w:t>On our secure European server — we manage everything</w:t>
       </w:r>
     </w:p>
     <w:p>
@@ -1502,16 +1466,7 @@
         <w:spacing w:after="60"/>
       </w:pPr>
       <w:r>
-        <w:t>On our secure European server (current demo setup) — we manage everything</w:t>
-      </w:r>
-    </w:p>
-    <w:p>
-      <w:pPr>
-        <w:pStyle w:val="ListBullet"/>
-        <w:spacing w:after="60"/>
-      </w:pPr>
-      <w:r>
-        <w:t>On your Dubai server — maximum data privacy, your data never leaves your premises</w:t>
+        <w:t>On your Dubai server — maximum data privacy</w:t>
       </w:r>
     </w:p>
     <w:p>
@@ -1519,7 +1474,7 @@
         <w:spacing w:after="120"/>
       </w:pPr>
       <w:r>
-        <w:t>Both options are included in the quoted price. You choose based on your preference.</w:t>
+        <w:t>Both options included in the quoted price.</w:t>
       </w:r>
     </w:p>
     <w:p>
@@ -1540,7 +1495,7 @@
         <w:spacing w:after="120"/>
       </w:pPr>
       <w:r>
-        <w:t>AreaKPI Solutions is led by Ashish Kamdar — a financial technology specialist with experience building surveillance and compliance systems for the Securities and Exchange Board of India (SEBI). With deep expertise in trading systems, real-time data processing, and regulatory technology, AreaKPI brings institutional-grade technology to the precious metals industry.</w:t>
+        <w:t>Led by Ashish Kamdar — financial technology specialist with experience building surveillance and compliance systems for SEBI (Securities and Exchange Board of India). Deep expertise in trading systems, real-time data, and regulatory technology.</w:t>
       </w:r>
     </w:p>
     <w:p>
@@ -1548,7 +1503,7 @@
         <w:spacing w:after="120"/>
       </w:pPr>
       <w:r>
-        <w:t>Based in Mumbai with direct availability at Matunga Gymkhana for ongoing face-to-face support.</w:t>
+        <w:t>Based in Mumbai with direct availability at Matunga Gymkhana.</w:t>
       </w:r>
     </w:p>
     <w:p>
@@ -1564,10 +1519,9 @@
         <w:spacing w:after="120"/>
       </w:pPr>
       <w:r>
-        <w:t>Please sign below to confirm acceptance of this quotation.</w:t>
+        <w:t>Please sign below to confirm acceptance.</w:t>
       </w:r>
     </w:p>
-    <w:p/>
     <w:p/>
     <w:tbl>
       <w:tblPr>
@@ -1702,7 +1656,7 @@
     <w:sectPr>
       <w:headerReference w:type="default" r:id="rId9"/>
       <w:pgSz w:w="12240" w:h="15840"/>
-      <w:pgMar w:top="2268" w:right="1417" w:bottom="1134" w:left="1417" w:header="283" w:footer="720" w:gutter="0"/>
+      <w:pgMar w:top="1984" w:right="1417" w:bottom="1134" w:left="1417" w:header="170" w:footer="720" w:gutter="0"/>
       <w:cols w:space="720"/>
       <w:docGrid w:linePitch="360"/>
     </w:sectPr>
@@ -1715,101 +1669,43 @@
   <w:p>
     <w:pPr>
       <w:pStyle w:val="Header"/>
-    </w:pPr>
+      <w:jc w:val="left"/>
+    </w:pPr>
+    <w:r>
+      <w:drawing>
+        <wp:inline xmlns:a="http://schemas.openxmlformats.org/drawingml/2006/main" xmlns:pic="http://schemas.openxmlformats.org/drawingml/2006/picture">
+          <wp:extent cx="5486400" cy="1128135"/>
+          <wp:docPr id="1" name="Picture 1"/>
+          <wp:cNvGraphicFramePr>
+            <a:graphicFrameLocks noChangeAspect="1"/>
+          </wp:cNvGraphicFramePr>
+          <a:graphic>
+            <a:graphicData uri="http://schemas.openxmlformats.org/drawingml/2006/picture">
+              <pic:pic>
+                <pic:nvPicPr>
+                  <pic:cNvPr id="0" name="AREA KPI Technology Letter Head.jpg"/>
+                  <pic:cNvPicPr/>
+                </pic:nvPicPr>
+                <pic:blipFill>
+                  <a:blip r:embed="rId1"/>
+                  <a:stretch>
+                    <a:fillRect/>
+                  </a:stretch>
+                </pic:blipFill>
+                <pic:spPr>
+                  <a:xfrm>
+                    <a:off x="0" y="0"/>
+                    <a:ext cx="5486400" cy="1128135"/>
+                  </a:xfrm>
+                  <a:prstGeom prst="rect"/>
+                </pic:spPr>
+              </pic:pic>
+            </a:graphicData>
+          </a:graphic>
+        </wp:inline>
+      </w:drawing>
+    </w:r>
   </w:p>
-  <w:tbl>
-    <w:tblPr>
-      <w:tblW w:type="auto" w:w="0"/>
-      <w:tblLayout w:type="autofit"/>
-      <w:tblLook w:firstColumn="1" w:firstRow="1" w:lastColumn="0" w:lastRow="0" w:noHBand="0" w:noVBand="1" w:val="04A0"/>
-    </w:tblPr>
-    <w:tblGrid>
-      <w:gridCol w:w="5040"/>
-      <w:gridCol w:w="5040"/>
-    </w:tblGrid>
-    <w:tr>
-      <w:tc>
-        <w:tcPr>
-          <w:tcW w:type="dxa" w:w="1728"/>
-        </w:tcPr>
-        <w:p>
-          <w:pPr>
-            <w:jc w:val="left"/>
-          </w:pPr>
-          <w:r>
-            <w:drawing>
-              <wp:inline xmlns:a="http://schemas.openxmlformats.org/drawingml/2006/main" xmlns:pic="http://schemas.openxmlformats.org/drawingml/2006/picture">
-                <wp:extent cx="822960" cy="958384"/>
-                <wp:docPr id="1" name="Picture 1"/>
-                <wp:cNvGraphicFramePr>
-                  <a:graphicFrameLocks noChangeAspect="1"/>
-                </wp:cNvGraphicFramePr>
-                <a:graphic>
-                  <a:graphicData uri="http://schemas.openxmlformats.org/drawingml/2006/picture">
-                    <pic:pic>
-                      <pic:nvPicPr>
-                        <pic:cNvPr id="0" name="image1.jpeg"/>
-                        <pic:cNvPicPr/>
-                      </pic:nvPicPr>
-                      <pic:blipFill>
-                        <a:blip r:embed="rId1"/>
-                        <a:stretch>
-                          <a:fillRect/>
-                        </a:stretch>
-                      </pic:blipFill>
-                      <pic:spPr>
-                        <a:xfrm>
-                          <a:off x="0" y="0"/>
-                          <a:ext cx="822960" cy="958384"/>
-                        </a:xfrm>
-                        <a:prstGeom prst="rect"/>
-                      </pic:spPr>
-                    </pic:pic>
-                  </a:graphicData>
-                </a:graphic>
-              </wp:inline>
-            </w:drawing>
-          </w:r>
-        </w:p>
-      </w:tc>
-      <w:tc>
-        <w:tcPr>
-          <w:tcW w:type="dxa" w:w="5040"/>
-        </w:tcPr>
-        <w:p>
-          <w:pPr>
-            <w:jc w:val="left"/>
-          </w:pPr>
-          <w:r>
-            <w:rPr>
-              <w:b/>
-              <w:color w:val="B8860B"/>
-              <w:sz w:val="32"/>
-            </w:rPr>
-            <w:t>AREA KPI Technology</w:t>
-          </w:r>
-        </w:p>
-        <w:p>
-          <w:r>
-            <w:rPr>
-              <w:color w:val="666666"/>
-              <w:sz w:val="16"/>
-            </w:rPr>
-            <w:t>302 Saumitra, 295-A Bhimani Street Matunga, Mumbai - 400019, India</w:t>
-          </w:r>
-        </w:p>
-        <w:p>
-          <w:r>
-            <w:rPr>
-              <w:color w:val="666666"/>
-              <w:sz w:val="16"/>
-            </w:rPr>
-            <w:t>Email: connect@areakpi.com  |  Cell: 98198 00214</w:t>
-          </w:r>
-        </w:p>
-      </w:tc>
-    </w:tr>
-  </w:tbl>
   <w:p>
     <w:pPr>
       <w:pBdr>

</xml_diff>

<commit_message>
feat: capability roadmap in quotation + collapsible section in Bot tab — 4 phases
</commit_message>
<xml_diff>
--- a/docs/PrismX-Quotation.docx
+++ b/docs/PrismX-Quotation.docx
@@ -163,15 +163,7 @@
         <w:spacing w:after="120"/>
       </w:pPr>
       <w:r>
-        <w:t>Following our meetings on 7 April and 9 April 2026, and the subsequent demonstration of the PrismX MIS Dashboard, this quotation covers the development and deployment of a comprehensive WhatsApp Business Intelligence Bot and Management Information System for PrismX's precious metals trading operations.</w:t>
-      </w:r>
-    </w:p>
-    <w:p>
-      <w:pPr>
-        <w:spacing w:after="120"/>
-      </w:pPr>
-      <w:r>
-        <w:t>The system will enable real-time visibility into trading activity, automated deal capture from WhatsApp conversations, payment confirmation through image recognition, and an executive dashboard accessible from any device.</w:t>
+        <w:t>Following our meetings on 7 April and 9 April 2026, and the demonstration of the PrismX MIS Dashboard, this quotation covers the development and deployment of a WhatsApp Business Intelligence Bot and Management Information System for PrismX's precious metals trading operations.</w:t>
       </w:r>
     </w:p>
     <w:p>
@@ -334,6 +326,963 @@
         <w:pStyle w:val="Heading1"/>
       </w:pPr>
       <w:r>
+        <w:t>Capability Roadmap</w:t>
+      </w:r>
+    </w:p>
+    <w:p>
+      <w:pPr>
+        <w:spacing w:after="120"/>
+      </w:pPr>
+      <w:r>
+        <w:t>The system is designed in progressive stages. Each stage adds capabilities without disrupting what is already working. You choose what you need and when.</w:t>
+      </w:r>
+    </w:p>
+    <w:p>
+      <w:pPr>
+        <w:pStyle w:val="Heading2"/>
+      </w:pPr>
+      <w:r>
+        <w:t>Available Now — No API Integration Required</w:t>
+      </w:r>
+    </w:p>
+    <w:p>
+      <w:pPr>
+        <w:spacing w:after="120"/>
+      </w:pPr>
+      <w:r>
+        <w:t>These capabilities work today using WhatsApp chat exports (.txt files):</w:t>
+      </w:r>
+    </w:p>
+    <w:tbl>
+      <w:tblPr>
+        <w:tblStyle w:val="LightShading-Accent1"/>
+        <w:tblW w:type="auto" w:w="0"/>
+        <w:jc w:val="center"/>
+        <w:tblLook w:firstColumn="1" w:firstRow="1" w:lastColumn="0" w:lastRow="0" w:noHBand="0" w:noVBand="1" w:val="04A0"/>
+      </w:tblPr>
+      <w:tblGrid>
+        <w:gridCol w:w="4703"/>
+        <w:gridCol w:w="4703"/>
+      </w:tblGrid>
+      <w:tr>
+        <w:tc>
+          <w:tcPr>
+            <w:tcW w:type="dxa" w:w="4703"/>
+          </w:tcPr>
+          <w:p>
+            <w:r>
+              <w:rPr>
+                <w:b/>
+                <w:sz w:val="18"/>
+              </w:rPr>
+              <w:t>Capability</w:t>
+            </w:r>
+          </w:p>
+        </w:tc>
+        <w:tc>
+          <w:tcPr>
+            <w:tcW w:type="dxa" w:w="4703"/>
+          </w:tcPr>
+          <w:p>
+            <w:r>
+              <w:rPr>
+                <w:b/>
+                <w:sz w:val="18"/>
+              </w:rPr>
+              <w:t>Status</w:t>
+            </w:r>
+          </w:p>
+        </w:tc>
+      </w:tr>
+      <w:tr>
+        <w:tc>
+          <w:tcPr>
+            <w:tcW w:type="dxa" w:w="4703"/>
+          </w:tcPr>
+          <w:p>
+            <w:r>
+              <w:rPr>
+                <w:sz w:val="18"/>
+              </w:rPr>
+              <w:t>Parse WhatsApp chat exports and extract deals</w:t>
+            </w:r>
+          </w:p>
+        </w:tc>
+        <w:tc>
+          <w:tcPr>
+            <w:tcW w:type="dxa" w:w="4703"/>
+          </w:tcPr>
+          <w:p>
+            <w:r>
+              <w:rPr>
+                <w:sz w:val="18"/>
+              </w:rPr>
+              <w:t>Working</w:t>
+            </w:r>
+          </w:p>
+        </w:tc>
+      </w:tr>
+      <w:tr>
+        <w:tc>
+          <w:tcPr>
+            <w:tcW w:type="dxa" w:w="4703"/>
+          </w:tcPr>
+          <w:p>
+            <w:r>
+              <w:rPr>
+                <w:sz w:val="18"/>
+              </w:rPr>
+              <w:t>Detect metal, quantity, price, premium/discount per deal</w:t>
+            </w:r>
+          </w:p>
+        </w:tc>
+        <w:tc>
+          <w:tcPr>
+            <w:tcW w:type="dxa" w:w="4703"/>
+          </w:tcPr>
+          <w:p>
+            <w:r>
+              <w:rPr>
+                <w:sz w:val="18"/>
+              </w:rPr>
+              <w:t>Working</w:t>
+            </w:r>
+          </w:p>
+        </w:tc>
+      </w:tr>
+      <w:tr>
+        <w:tc>
+          <w:tcPr>
+            <w:tcW w:type="dxa" w:w="4703"/>
+          </w:tcPr>
+          <w:p>
+            <w:r>
+              <w:rPr>
+                <w:sz w:val="18"/>
+              </w:rPr>
+              <w:t>Classify deals: locked, working, settled, cancelled</w:t>
+            </w:r>
+          </w:p>
+        </w:tc>
+        <w:tc>
+          <w:tcPr>
+            <w:tcW w:type="dxa" w:w="4703"/>
+          </w:tcPr>
+          <w:p>
+            <w:r>
+              <w:rPr>
+                <w:sz w:val="18"/>
+              </w:rPr>
+              <w:t>Working</w:t>
+            </w:r>
+          </w:p>
+        </w:tc>
+      </w:tr>
+      <w:tr>
+        <w:tc>
+          <w:tcPr>
+            <w:tcW w:type="dxa" w:w="4703"/>
+          </w:tcPr>
+          <w:p>
+            <w:r>
+              <w:rPr>
+                <w:sz w:val="18"/>
+              </w:rPr>
+              <w:t>Identify participants and counterparties</w:t>
+            </w:r>
+          </w:p>
+        </w:tc>
+        <w:tc>
+          <w:tcPr>
+            <w:tcW w:type="dxa" w:w="4703"/>
+          </w:tcPr>
+          <w:p>
+            <w:r>
+              <w:rPr>
+                <w:sz w:val="18"/>
+              </w:rPr>
+              <w:t>Working</w:t>
+            </w:r>
+          </w:p>
+        </w:tc>
+      </w:tr>
+      <w:tr>
+        <w:tc>
+          <w:tcPr>
+            <w:tcW w:type="dxa" w:w="4703"/>
+          </w:tcPr>
+          <w:p>
+            <w:r>
+              <w:rPr>
+                <w:sz w:val="18"/>
+              </w:rPr>
+              <w:t>Image OCR: read payment screenshots (USDT amounts, wallets, dates)</w:t>
+            </w:r>
+          </w:p>
+        </w:tc>
+        <w:tc>
+          <w:tcPr>
+            <w:tcW w:type="dxa" w:w="4703"/>
+          </w:tcPr>
+          <w:p>
+            <w:r>
+              <w:rPr>
+                <w:sz w:val="18"/>
+              </w:rPr>
+              <w:t>Working</w:t>
+            </w:r>
+          </w:p>
+        </w:tc>
+      </w:tr>
+      <w:tr>
+        <w:tc>
+          <w:tcPr>
+            <w:tcW w:type="dxa" w:w="4703"/>
+          </w:tcPr>
+          <w:p>
+            <w:r>
+              <w:rPr>
+                <w:sz w:val="18"/>
+              </w:rPr>
+              <w:t>Filter and sort deals by source, metal, status, date, amount</w:t>
+            </w:r>
+          </w:p>
+        </w:tc>
+        <w:tc>
+          <w:tcPr>
+            <w:tcW w:type="dxa" w:w="4703"/>
+          </w:tcPr>
+          <w:p>
+            <w:r>
+              <w:rPr>
+                <w:sz w:val="18"/>
+              </w:rPr>
+              <w:t>Working</w:t>
+            </w:r>
+          </w:p>
+        </w:tc>
+      </w:tr>
+      <w:tr>
+        <w:tc>
+          <w:tcPr>
+            <w:tcW w:type="dxa" w:w="4703"/>
+          </w:tcPr>
+          <w:p>
+            <w:r>
+              <w:rPr>
+                <w:sz w:val="18"/>
+              </w:rPr>
+              <w:t>Multi-language: English, Chinese, Arabic</w:t>
+            </w:r>
+          </w:p>
+        </w:tc>
+        <w:tc>
+          <w:tcPr>
+            <w:tcW w:type="dxa" w:w="4703"/>
+          </w:tcPr>
+          <w:p>
+            <w:r>
+              <w:rPr>
+                <w:sz w:val="18"/>
+              </w:rPr>
+              <w:t>Working</w:t>
+            </w:r>
+          </w:p>
+        </w:tc>
+      </w:tr>
+      <w:tr>
+        <w:tc>
+          <w:tcPr>
+            <w:tcW w:type="dxa" w:w="4703"/>
+          </w:tcPr>
+          <w:p>
+            <w:r>
+              <w:rPr>
+                <w:sz w:val="18"/>
+              </w:rPr>
+              <w:t>MIS Dashboard with portfolio, stock, P&amp;L, reports</w:t>
+            </w:r>
+          </w:p>
+        </w:tc>
+        <w:tc>
+          <w:tcPr>
+            <w:tcW w:type="dxa" w:w="4703"/>
+          </w:tcPr>
+          <w:p>
+            <w:r>
+              <w:rPr>
+                <w:sz w:val="18"/>
+              </w:rPr>
+              <w:t>Working</w:t>
+            </w:r>
+          </w:p>
+        </w:tc>
+      </w:tr>
+    </w:tbl>
+    <w:p/>
+    <w:p>
+      <w:pPr>
+        <w:pStyle w:val="Heading2"/>
+      </w:pPr>
+      <w:r>
+        <w:t>Unlocked With Meta WhatsApp API</w:t>
+      </w:r>
+    </w:p>
+    <w:p>
+      <w:pPr>
+        <w:spacing w:after="120"/>
+      </w:pPr>
+      <w:r>
+        <w:t>Once your WhatsApp Business number is connected to Meta's Cloud API, the following capabilities activate automatically:</w:t>
+      </w:r>
+    </w:p>
+    <w:tbl>
+      <w:tblPr>
+        <w:tblStyle w:val="LightShading-Accent1"/>
+        <w:tblW w:type="auto" w:w="0"/>
+        <w:jc w:val="center"/>
+        <w:tblLook w:firstColumn="1" w:firstRow="1" w:lastColumn="0" w:lastRow="0" w:noHBand="0" w:noVBand="1" w:val="04A0"/>
+      </w:tblPr>
+      <w:tblGrid>
+        <w:gridCol w:w="4703"/>
+        <w:gridCol w:w="4703"/>
+      </w:tblGrid>
+      <w:tr>
+        <w:tc>
+          <w:tcPr>
+            <w:tcW w:type="dxa" w:w="4703"/>
+          </w:tcPr>
+          <w:p>
+            <w:r>
+              <w:rPr>
+                <w:b/>
+                <w:sz w:val="18"/>
+              </w:rPr>
+              <w:t>Capability</w:t>
+            </w:r>
+          </w:p>
+        </w:tc>
+        <w:tc>
+          <w:tcPr>
+            <w:tcW w:type="dxa" w:w="4703"/>
+          </w:tcPr>
+          <w:p>
+            <w:r>
+              <w:rPr>
+                <w:b/>
+                <w:sz w:val="18"/>
+              </w:rPr>
+              <w:t>What Changes</w:t>
+            </w:r>
+          </w:p>
+        </w:tc>
+      </w:tr>
+      <w:tr>
+        <w:tc>
+          <w:tcPr>
+            <w:tcW w:type="dxa" w:w="4703"/>
+          </w:tcPr>
+          <w:p>
+            <w:r>
+              <w:rPr>
+                <w:sz w:val="18"/>
+              </w:rPr>
+              <w:t>Real-time message capture</w:t>
+            </w:r>
+          </w:p>
+        </w:tc>
+        <w:tc>
+          <w:tcPr>
+            <w:tcW w:type="dxa" w:w="4703"/>
+          </w:tcPr>
+          <w:p>
+            <w:r>
+              <w:rPr>
+                <w:sz w:val="18"/>
+              </w:rPr>
+              <w:t>No more exporting chats — every message appears instantly</w:t>
+            </w:r>
+          </w:p>
+        </w:tc>
+      </w:tr>
+      <w:tr>
+        <w:tc>
+          <w:tcPr>
+            <w:tcW w:type="dxa" w:w="4703"/>
+          </w:tcPr>
+          <w:p>
+            <w:r>
+              <w:rPr>
+                <w:sz w:val="18"/>
+              </w:rPr>
+              <w:t>Live deal detection</w:t>
+            </w:r>
+          </w:p>
+        </w:tc>
+        <w:tc>
+          <w:tcPr>
+            <w:tcW w:type="dxa" w:w="4703"/>
+          </w:tcPr>
+          <w:p>
+            <w:r>
+              <w:rPr>
+                <w:sz w:val="18"/>
+              </w:rPr>
+              <w:t>Deals captured the moment "lock" is typed</w:t>
+            </w:r>
+          </w:p>
+        </w:tc>
+      </w:tr>
+      <w:tr>
+        <w:tc>
+          <w:tcPr>
+            <w:tcW w:type="dxa" w:w="4703"/>
+          </w:tcPr>
+          <w:p>
+            <w:r>
+              <w:rPr>
+                <w:sz w:val="18"/>
+              </w:rPr>
+              <w:t>Live image OCR</w:t>
+            </w:r>
+          </w:p>
+        </w:tc>
+        <w:tc>
+          <w:tcPr>
+            <w:tcW w:type="dxa" w:w="4703"/>
+          </w:tcPr>
+          <w:p>
+            <w:r>
+              <w:rPr>
+                <w:sz w:val="18"/>
+              </w:rPr>
+              <w:t>Payment screenshots read automatically as they are shared</w:t>
+            </w:r>
+          </w:p>
+        </w:tc>
+      </w:tr>
+      <w:tr>
+        <w:tc>
+          <w:tcPr>
+            <w:tcW w:type="dxa" w:w="4703"/>
+          </w:tcPr>
+          <w:p>
+            <w:r>
+              <w:rPr>
+                <w:sz w:val="18"/>
+              </w:rPr>
+              <w:t>Contact directory</w:t>
+            </w:r>
+          </w:p>
+        </w:tc>
+        <w:tc>
+          <w:tcPr>
+            <w:tcW w:type="dxa" w:w="4703"/>
+          </w:tcPr>
+          <w:p>
+            <w:r>
+              <w:rPr>
+                <w:sz w:val="18"/>
+              </w:rPr>
+              <w:t>All WhatsApp contacts auto-populated with deal history</w:t>
+            </w:r>
+          </w:p>
+        </w:tc>
+      </w:tr>
+      <w:tr>
+        <w:tc>
+          <w:tcPr>
+            <w:tcW w:type="dxa" w:w="4703"/>
+          </w:tcPr>
+          <w:p>
+            <w:r>
+              <w:rPr>
+                <w:sz w:val="18"/>
+              </w:rPr>
+              <w:t>Instant notifications</w:t>
+            </w:r>
+          </w:p>
+        </w:tc>
+        <w:tc>
+          <w:tcPr>
+            <w:tcW w:type="dxa" w:w="4703"/>
+          </w:tcPr>
+          <w:p>
+            <w:r>
+              <w:rPr>
+                <w:sz w:val="18"/>
+              </w:rPr>
+              <w:t>Deal lock alerts on any screen, any device</w:t>
+            </w:r>
+          </w:p>
+        </w:tc>
+      </w:tr>
+      <w:tr>
+        <w:tc>
+          <w:tcPr>
+            <w:tcW w:type="dxa" w:w="4703"/>
+          </w:tcPr>
+          <w:p>
+            <w:r>
+              <w:rPr>
+                <w:sz w:val="18"/>
+              </w:rPr>
+              <w:t>Multi-device visibility</w:t>
+            </w:r>
+          </w:p>
+        </w:tc>
+        <w:tc>
+          <w:tcPr>
+            <w:tcW w:type="dxa" w:w="4703"/>
+          </w:tcPr>
+          <w:p>
+            <w:r>
+              <w:rPr>
+                <w:sz w:val="18"/>
+              </w:rPr>
+              <w:t>See on your phone what staff does on WhatsApp Web</w:t>
+            </w:r>
+          </w:p>
+        </w:tc>
+      </w:tr>
+    </w:tbl>
+    <w:p/>
+    <w:p>
+      <w:pPr>
+        <w:pStyle w:val="Heading2"/>
+      </w:pPr>
+      <w:r>
+        <w:t>Phase 2 — After Go-Live (2-4 Weeks)</w:t>
+      </w:r>
+    </w:p>
+    <w:p>
+      <w:pPr>
+        <w:spacing w:after="120"/>
+      </w:pPr>
+      <w:r>
+        <w:t>Additional capabilities available after the system is running with live data:</w:t>
+      </w:r>
+    </w:p>
+    <w:tbl>
+      <w:tblPr>
+        <w:tblStyle w:val="LightShading-Accent1"/>
+        <w:tblW w:type="auto" w:w="0"/>
+        <w:jc w:val="center"/>
+        <w:tblLook w:firstColumn="1" w:firstRow="1" w:lastColumn="0" w:lastRow="0" w:noHBand="0" w:noVBand="1" w:val="04A0"/>
+      </w:tblPr>
+      <w:tblGrid>
+        <w:gridCol w:w="4703"/>
+        <w:gridCol w:w="4703"/>
+      </w:tblGrid>
+      <w:tr>
+        <w:tc>
+          <w:tcPr>
+            <w:tcW w:type="dxa" w:w="4703"/>
+          </w:tcPr>
+          <w:p>
+            <w:r>
+              <w:rPr>
+                <w:b/>
+                <w:sz w:val="18"/>
+              </w:rPr>
+              <w:t>Capability</w:t>
+            </w:r>
+          </w:p>
+        </w:tc>
+        <w:tc>
+          <w:tcPr>
+            <w:tcW w:type="dxa" w:w="4703"/>
+          </w:tcPr>
+          <w:p>
+            <w:r>
+              <w:rPr>
+                <w:b/>
+                <w:sz w:val="18"/>
+              </w:rPr>
+              <w:t>Description</w:t>
+            </w:r>
+          </w:p>
+        </w:tc>
+      </w:tr>
+      <w:tr>
+        <w:tc>
+          <w:tcPr>
+            <w:tcW w:type="dxa" w:w="4703"/>
+          </w:tcPr>
+          <w:p>
+            <w:r>
+              <w:rPr>
+                <w:sz w:val="18"/>
+              </w:rPr>
+              <w:t>OroSoft data bridge</w:t>
+            </w:r>
+          </w:p>
+        </w:tc>
+        <w:tc>
+          <w:tcPr>
+            <w:tcW w:type="dxa" w:w="4703"/>
+          </w:tcPr>
+          <w:p>
+            <w:r>
+              <w:rPr>
+                <w:sz w:val="18"/>
+              </w:rPr>
+              <w:t>Dashboard reads from your existing ERP — full MIS with real data</w:t>
+            </w:r>
+          </w:p>
+        </w:tc>
+      </w:tr>
+      <w:tr>
+        <w:tc>
+          <w:tcPr>
+            <w:tcW w:type="dxa" w:w="4703"/>
+          </w:tcPr>
+          <w:p>
+            <w:r>
+              <w:rPr>
+                <w:sz w:val="18"/>
+              </w:rPr>
+              <w:t>Payment matching</w:t>
+            </w:r>
+          </w:p>
+        </w:tc>
+        <w:tc>
+          <w:tcPr>
+            <w:tcW w:type="dxa" w:w="4703"/>
+          </w:tcPr>
+          <w:p>
+            <w:r>
+              <w:rPr>
+                <w:sz w:val="18"/>
+              </w:rPr>
+              <w:t>OCR screenshots auto-matched to specific deals</w:t>
+            </w:r>
+          </w:p>
+        </w:tc>
+      </w:tr>
+      <w:tr>
+        <w:tc>
+          <w:tcPr>
+            <w:tcW w:type="dxa" w:w="4703"/>
+          </w:tcPr>
+          <w:p>
+            <w:r>
+              <w:rPr>
+                <w:sz w:val="18"/>
+              </w:rPr>
+              <w:t>Deal history &amp; analytics</w:t>
+            </w:r>
+          </w:p>
+        </w:tc>
+        <w:tc>
+          <w:tcPr>
+            <w:tcW w:type="dxa" w:w="4703"/>
+          </w:tcPr>
+          <w:p>
+            <w:r>
+              <w:rPr>
+                <w:sz w:val="18"/>
+              </w:rPr>
+              <w:t>Trends, top counterparties, most traded metals, avg deal size</w:t>
+            </w:r>
+          </w:p>
+        </w:tc>
+      </w:tr>
+      <w:tr>
+        <w:tc>
+          <w:tcPr>
+            <w:tcW w:type="dxa" w:w="4703"/>
+          </w:tcPr>
+          <w:p>
+            <w:r>
+              <w:rPr>
+                <w:sz w:val="18"/>
+              </w:rPr>
+              <w:t>Settlement tracking</w:t>
+            </w:r>
+          </w:p>
+        </w:tc>
+        <w:tc>
+          <w:tcPr>
+            <w:tcW w:type="dxa" w:w="4703"/>
+          </w:tcPr>
+          <w:p>
+            <w:r>
+              <w:rPr>
+                <w:sz w:val="18"/>
+              </w:rPr>
+              <w:t>Track HK payments remitted to UAE vs pending</w:t>
+            </w:r>
+          </w:p>
+        </w:tc>
+      </w:tr>
+      <w:tr>
+        <w:tc>
+          <w:tcPr>
+            <w:tcW w:type="dxa" w:w="4703"/>
+          </w:tcPr>
+          <w:p>
+            <w:r>
+              <w:rPr>
+                <w:sz w:val="18"/>
+              </w:rPr>
+              <w:t>Multi-group support</w:t>
+            </w:r>
+          </w:p>
+        </w:tc>
+        <w:tc>
+          <w:tcPr>
+            <w:tcW w:type="dxa" w:w="4703"/>
+          </w:tcPr>
+          <w:p>
+            <w:r>
+              <w:rPr>
+                <w:sz w:val="18"/>
+              </w:rPr>
+              <w:t>Handle 10+ WhatsApp groups simultaneously</w:t>
+            </w:r>
+          </w:p>
+        </w:tc>
+      </w:tr>
+    </w:tbl>
+    <w:p/>
+    <w:p>
+      <w:pPr>
+        <w:pStyle w:val="Heading2"/>
+      </w:pPr>
+      <w:r>
+        <w:t>Phase 3 — Future Capabilities (Quoted Separately)</w:t>
+      </w:r>
+    </w:p>
+    <w:p>
+      <w:pPr>
+        <w:spacing w:after="120"/>
+      </w:pPr>
+      <w:r>
+        <w:t>Premium capabilities that can be added when you are ready:</w:t>
+      </w:r>
+    </w:p>
+    <w:tbl>
+      <w:tblPr>
+        <w:tblStyle w:val="LightShading-Accent1"/>
+        <w:tblW w:type="auto" w:w="0"/>
+        <w:jc w:val="center"/>
+        <w:tblLook w:firstColumn="1" w:firstRow="1" w:lastColumn="0" w:lastRow="0" w:noHBand="0" w:noVBand="1" w:val="04A0"/>
+      </w:tblPr>
+      <w:tblGrid>
+        <w:gridCol w:w="4703"/>
+        <w:gridCol w:w="4703"/>
+      </w:tblGrid>
+      <w:tr>
+        <w:tc>
+          <w:tcPr>
+            <w:tcW w:type="dxa" w:w="4703"/>
+          </w:tcPr>
+          <w:p>
+            <w:r>
+              <w:rPr>
+                <w:b/>
+                <w:sz w:val="18"/>
+              </w:rPr>
+              <w:t>Capability</w:t>
+            </w:r>
+          </w:p>
+        </w:tc>
+        <w:tc>
+          <w:tcPr>
+            <w:tcW w:type="dxa" w:w="4703"/>
+          </w:tcPr>
+          <w:p>
+            <w:r>
+              <w:rPr>
+                <w:b/>
+                <w:sz w:val="18"/>
+              </w:rPr>
+              <w:t>Description</w:t>
+            </w:r>
+          </w:p>
+        </w:tc>
+      </w:tr>
+      <w:tr>
+        <w:tc>
+          <w:tcPr>
+            <w:tcW w:type="dxa" w:w="4703"/>
+          </w:tcPr>
+          <w:p>
+            <w:r>
+              <w:rPr>
+                <w:sz w:val="18"/>
+              </w:rPr>
+              <w:t>Bot confirmations</w:t>
+            </w:r>
+          </w:p>
+        </w:tc>
+        <w:tc>
+          <w:tcPr>
+            <w:tcW w:type="dxa" w:w="4703"/>
+          </w:tcPr>
+          <w:p>
+            <w:r>
+              <w:rPr>
+                <w:sz w:val="18"/>
+              </w:rPr>
+              <w:t>Auto-reply "Deal noted" when deal is detected</w:t>
+            </w:r>
+          </w:p>
+        </w:tc>
+      </w:tr>
+      <w:tr>
+        <w:tc>
+          <w:tcPr>
+            <w:tcW w:type="dxa" w:w="4703"/>
+          </w:tcPr>
+          <w:p>
+            <w:r>
+              <w:rPr>
+                <w:sz w:val="18"/>
+              </w:rPr>
+              <w:t>AI daily summary</w:t>
+            </w:r>
+          </w:p>
+        </w:tc>
+        <w:tc>
+          <w:tcPr>
+            <w:tcW w:type="dxa" w:w="4703"/>
+          </w:tcPr>
+          <w:p>
+            <w:r>
+              <w:rPr>
+                <w:sz w:val="18"/>
+              </w:rPr>
+              <w:t>End-of-day report sent to your WhatsApp: deals, volume, USDT total</w:t>
+            </w:r>
+          </w:p>
+        </w:tc>
+      </w:tr>
+      <w:tr>
+        <w:tc>
+          <w:tcPr>
+            <w:tcW w:type="dxa" w:w="4703"/>
+          </w:tcPr>
+          <w:p>
+            <w:r>
+              <w:rPr>
+                <w:sz w:val="18"/>
+              </w:rPr>
+              <w:t>AI auto-negotiator</w:t>
+            </w:r>
+          </w:p>
+        </w:tc>
+        <w:tc>
+          <w:tcPr>
+            <w:tcW w:type="dxa" w:w="4703"/>
+          </w:tcPr>
+          <w:p>
+            <w:r>
+              <w:rPr>
+                <w:sz w:val="18"/>
+              </w:rPr>
+              <w:t>Bot negotiates buy/sell prices within your boundaries</w:t>
+            </w:r>
+          </w:p>
+        </w:tc>
+      </w:tr>
+      <w:tr>
+        <w:tc>
+          <w:tcPr>
+            <w:tcW w:type="dxa" w:w="4703"/>
+          </w:tcPr>
+          <w:p>
+            <w:r>
+              <w:rPr>
+                <w:sz w:val="18"/>
+              </w:rPr>
+              <w:t>Smart alerts</w:t>
+            </w:r>
+          </w:p>
+        </w:tc>
+        <w:tc>
+          <w:tcPr>
+            <w:tcW w:type="dxa" w:w="4703"/>
+          </w:tcPr>
+          <w:p>
+            <w:r>
+              <w:rPr>
+                <w:sz w:val="18"/>
+              </w:rPr>
+              <w:t>Low stock, pending payments, new counterparty warnings</w:t>
+            </w:r>
+          </w:p>
+        </w:tc>
+      </w:tr>
+      <w:tr>
+        <w:tc>
+          <w:tcPr>
+            <w:tcW w:type="dxa" w:w="4703"/>
+          </w:tcPr>
+          <w:p>
+            <w:r>
+              <w:rPr>
+                <w:sz w:val="18"/>
+              </w:rPr>
+              <w:t>Voice note transcription</w:t>
+            </w:r>
+          </w:p>
+        </w:tc>
+        <w:tc>
+          <w:tcPr>
+            <w:tcW w:type="dxa" w:w="4703"/>
+          </w:tcPr>
+          <w:p>
+            <w:r>
+              <w:rPr>
+                <w:sz w:val="18"/>
+              </w:rPr>
+              <w:t>Convert WhatsApp voice messages to text and parse for deals</w:t>
+            </w:r>
+          </w:p>
+        </w:tc>
+      </w:tr>
+      <w:tr>
+        <w:tc>
+          <w:tcPr>
+            <w:tcW w:type="dxa" w:w="4703"/>
+          </w:tcPr>
+          <w:p>
+            <w:r>
+              <w:rPr>
+                <w:sz w:val="18"/>
+              </w:rPr>
+              <w:t>Theme-aware interface</w:t>
+            </w:r>
+          </w:p>
+        </w:tc>
+        <w:tc>
+          <w:tcPr>
+            <w:tcW w:type="dxa" w:w="4703"/>
+          </w:tcPr>
+          <w:p>
+            <w:r>
+              <w:rPr>
+                <w:sz w:val="18"/>
+              </w:rPr>
+              <w:t>Dark and light theme support across all screens</w:t>
+            </w:r>
+          </w:p>
+        </w:tc>
+      </w:tr>
+    </w:tbl>
+    <w:p/>
+    <w:p>
+      <w:r>
+        <w:br w:type="page"/>
+      </w:r>
+    </w:p>
+    <w:p>
+      <w:pPr>
+        <w:pStyle w:val="Heading1"/>
+      </w:pPr>
+      <w:r>
         <w:t>Scope of Work</w:t>
       </w:r>
     </w:p>
@@ -350,7 +1299,7 @@
         <w:spacing w:after="120"/>
       </w:pPr>
       <w:r>
-        <w:t>A secure, mobile-first executive dashboard providing real-time visibility into all trading operations.</w:t>
+        <w:t>Secure, mobile-first executive dashboard with real-time visibility into all trading operations.</w:t>
       </w:r>
     </w:p>
     <w:p>
@@ -368,7 +1317,7 @@
         <w:spacing w:after="60"/>
       </w:pPr>
       <w:r>
-        <w:t>Daily profit and loss — realized P&amp;L from completed sales</w:t>
+        <w:t>Daily P&amp;L — realized profit from completed sales</w:t>
       </w:r>
     </w:p>
     <w:p>
@@ -377,7 +1326,7 @@
         <w:spacing w:after="60"/>
       </w:pPr>
       <w:r>
-        <w:t>Stock tracking — buy increases, sell decreases, low stock alerts</w:t>
+        <w:t>Stock tracking — increases on buy, decreases on sell, low stock alerts</w:t>
       </w:r>
     </w:p>
     <w:p>
@@ -386,7 +1335,7 @@
         <w:spacing w:after="60"/>
       </w:pPr>
       <w:r>
-        <w:t>Purchase management — with refining cost calculation for impure metals</w:t>
+        <w:t>Purchase management — refining cost calculation for impure metals (18K, 20K, 22K)</w:t>
       </w:r>
     </w:p>
     <w:p>
@@ -395,7 +1344,7 @@
         <w:spacing w:after="60"/>
       </w:pPr>
       <w:r>
-        <w:t>Sale management — with loss warning when selling below cost</w:t>
+        <w:t>Sale management — loss warning when selling below cost</w:t>
       </w:r>
     </w:p>
     <w:p>
@@ -440,7 +1389,7 @@
         <w:spacing w:after="60"/>
       </w:pPr>
       <w:r>
-        <w:t>Live precious metal prices — London Fix (LBMA)</w:t>
+        <w:t>Precious metal prices — London Fix (LBMA)</w:t>
       </w:r>
     </w:p>
     <w:p>
@@ -474,7 +1423,7 @@
         <w:spacing w:after="60"/>
       </w:pPr>
       <w:r>
-        <w:t>Automatic deal detection — identifies buy/sell, metal, quantity, price, premium/discount</w:t>
+        <w:t>Automatic deal detection — buy/sell, metal, quantity, price, premium/discount</w:t>
       </w:r>
     </w:p>
     <w:p>
@@ -483,7 +1432,7 @@
         <w:spacing w:after="60"/>
       </w:pPr>
       <w:r>
-        <w:t>Lock detection — English, Chinese (鎖價), and Arabic (قفل)</w:t>
+        <w:t>Lock detection — English, Chinese (鎖價), Arabic (قفل)</w:t>
       </w:r>
     </w:p>
     <w:p>
@@ -501,7 +1450,7 @@
         <w:spacing w:after="60"/>
       </w:pPr>
       <w:r>
-        <w:t>Participant tracking — deal counterparties identified</w:t>
+        <w:t>Participant tracking — counterparties identified</w:t>
       </w:r>
     </w:p>
     <w:p>
@@ -519,7 +1468,7 @@
         <w:spacing w:after="60"/>
       </w:pPr>
       <w:r>
-        <w:t>WhatsApp tab in dashboard — all conversations visible</w:t>
+        <w:t>WhatsApp tab — all conversations visible in dashboard</w:t>
       </w:r>
     </w:p>
     <w:p>
@@ -544,7 +1493,7 @@
         <w:spacing w:after="120"/>
       </w:pPr>
       <w:r>
-        <w:t>Reads images shared in WhatsApp — payment confirmations, bar lists, weighing photos — and extracts structured data.</w:t>
+        <w:t>Reads images shared in WhatsApp — payment confirmations, bar lists, weighing photos.</w:t>
       </w:r>
     </w:p>
     <w:p>
@@ -571,7 +1520,7 @@
         <w:spacing w:after="60"/>
       </w:pPr>
       <w:r>
-        <w:t>Bar list photos — weight, bar count, serial numbers</w:t>
+        <w:t>Bar list photos — weight, bar count</w:t>
       </w:r>
     </w:p>
     <w:p>
@@ -589,7 +1538,7 @@
         <w:spacing w:after="60"/>
       </w:pPr>
       <w:r>
-        <w:t>Built-in OCR engine included at no additional cost</w:t>
+        <w:t>Built-in OCR engine at no additional cost</w:t>
       </w:r>
     </w:p>
     <w:p>
@@ -598,7 +1547,7 @@
         <w:spacing w:after="60"/>
       </w:pPr>
       <w:r>
-        <w:t>Optional premium: Google Cloud Vision (1,000 images/month free), Claude AI, GPT-4o</w:t>
+        <w:t>Optional premium: Google Cloud Vision (1,000 free/month), Claude AI, GPT-4o</w:t>
       </w:r>
     </w:p>
     <w:p>
@@ -607,7 +1556,7 @@
         <w:spacing w:after="60"/>
       </w:pPr>
       <w:r>
-        <w:t>Automatic payment matching to corresponding deals</w:t>
+        <w:t>Automatic payment matching to deals</w:t>
       </w:r>
     </w:p>
     <w:p>
@@ -623,7 +1572,7 @@
         <w:spacing w:after="120"/>
       </w:pPr>
       <w:r>
-        <w:t>Connects the dashboard to your existing OroSoft Neo trading software. Staff continues using OroSoft — the dashboard reads data automatically.</w:t>
+        <w:t>Connects dashboard to your existing OroSoft Neo software. Staff continues using OroSoft — dashboard reads data automatically.</w:t>
       </w:r>
     </w:p>
     <w:p>
@@ -650,7 +1599,7 @@
         <w:spacing w:after="60"/>
       </w:pPr>
       <w:r>
-        <w:t>One-time setup on your Dubai server or AWS instance</w:t>
+        <w:t>One-time setup on your server</w:t>
       </w:r>
     </w:p>
     <w:p>
@@ -665,75 +1614,6 @@
     <w:p>
       <w:r>
         <w:br w:type="page"/>
-      </w:r>
-    </w:p>
-    <w:p>
-      <w:pPr>
-        <w:pStyle w:val="Heading1"/>
-      </w:pPr>
-      <w:r>
-        <w:t>Future Capability: AI Auto-Negotiation Bot</w:t>
-      </w:r>
-    </w:p>
-    <w:p>
-      <w:pPr>
-        <w:spacing w:after="120"/>
-      </w:pPr>
-      <w:r>
-        <w:t>Once operational, an AI bot can be added that responds to buyers on WhatsApp automatically:</w:t>
-      </w:r>
-    </w:p>
-    <w:p>
-      <w:pPr>
-        <w:pStyle w:val="ListBullet"/>
-        <w:spacing w:after="60"/>
-      </w:pPr>
-      <w:r>
-        <w:t>Knows your inventory and floor prices in real-time</w:t>
-      </w:r>
-    </w:p>
-    <w:p>
-      <w:pPr>
-        <w:pStyle w:val="ListBullet"/>
-        <w:spacing w:after="60"/>
-      </w:pPr>
-      <w:r>
-        <w:t>Negotiates within your boundaries — cannot go below your minimum</w:t>
-      </w:r>
-    </w:p>
-    <w:p>
-      <w:pPr>
-        <w:pStyle w:val="ListBullet"/>
-        <w:spacing w:after="60"/>
-      </w:pPr>
-      <w:r>
-        <w:t>Escalates large deals for manual approval</w:t>
-      </w:r>
-    </w:p>
-    <w:p>
-      <w:pPr>
-        <w:pStyle w:val="ListBullet"/>
-        <w:spacing w:after="60"/>
-      </w:pPr>
-      <w:r>
-        <w:t>Works 24/7 across time zones</w:t>
-      </w:r>
-    </w:p>
-    <w:p>
-      <w:pPr>
-        <w:pStyle w:val="ListBullet"/>
-        <w:spacing w:after="60"/>
-      </w:pPr>
-      <w:r>
-        <w:t>Full audit trail of every conversation</w:t>
-      </w:r>
-    </w:p>
-    <w:p>
-      <w:pPr>
-        <w:spacing w:after="120"/>
-      </w:pPr>
-      <w:r>
-        <w:t>This module will be quoted separately after the core system is operational.</w:t>
       </w:r>
     </w:p>
     <w:p>
@@ -1022,8 +1902,7 @@
           <w:p>
             <w:r>
               <w:rPr>
-                <w:b/>
-                <w:sz w:val="20"/>
+                <w:sz w:val="18"/>
               </w:rPr>
               <w:t>Total (One-Time)</w:t>
             </w:r>
@@ -1117,9 +1996,7 @@
               <w:rPr>
                 <w:sz w:val="18"/>
               </w:rPr>
-              <w:t>₹ 50,000/year</w:t>
-              <w:br/>
-              <w:t>(from Year 2)</w:t>
+              <w:t>₹ 50,000/year (from Year 2)</w:t>
             </w:r>
           </w:p>
         </w:tc>
@@ -1131,7 +2008,7 @@
         <w:spacing w:after="120"/>
       </w:pPr>
       <w:r>
-        <w:t>Note: Module 1 (Dashboard) is included at no charge. The investment covers Modules 2, 3, and 4 — live WhatsApp integration, image recognition, and OroSoft connectivity.</w:t>
+        <w:t>Note: Module 1 (Dashboard) is included at no charge. Phase 3 capabilities (AI auto-negotiator, voice transcription, smart alerts) will be quoted separately when required.</w:t>
       </w:r>
     </w:p>
     <w:p>
@@ -1256,7 +2133,7 @@
               <w:rPr>
                 <w:sz w:val="18"/>
               </w:rPr>
-              <w:t>WhatsApp API connection + live messages</w:t>
+              <w:t>WhatsApp API connection + live messages on dashboard</w:t>
             </w:r>
           </w:p>
         </w:tc>
@@ -1297,7 +2174,7 @@
               <w:rPr>
                 <w:sz w:val="18"/>
               </w:rPr>
-              <w:t>Deal detection + Image OCR</w:t>
+              <w:t>Deal auto-detection + Image OCR on live messages</w:t>
             </w:r>
           </w:p>
         </w:tc>
@@ -1338,7 +2215,7 @@
               <w:rPr>
                 <w:sz w:val="18"/>
               </w:rPr>
-              <w:t>OroSoft bridge + integration testing</w:t>
+              <w:t>OroSoft data bridge + full integration testing</w:t>
             </w:r>
           </w:p>
         </w:tc>
@@ -1379,7 +2256,7 @@
               <w:rPr>
                 <w:sz w:val="18"/>
               </w:rPr>
-              <w:t>Staff training + Go-live</w:t>
+              <w:t>Staff training (30 min) + Go-live</w:t>
             </w:r>
           </w:p>
         </w:tc>
@@ -1466,7 +2343,7 @@
         <w:spacing w:after="60"/>
       </w:pPr>
       <w:r>
-        <w:t>On your Dubai server — maximum data privacy</w:t>
+        <w:t>On your Dubai server — maximum data privacy, your data never leaves your premises</w:t>
       </w:r>
     </w:p>
     <w:p>

</xml_diff>